<commit_message>
Atualiza roteiros AP3 da Semana 4
</commit_message>
<xml_diff>
--- a/MATERIAL_2027/C2/S4/DADOS3EMC2B1S4A3_AP3_aluno.docx
+++ b/MATERIAL_2027/C2/S4/DADOS3EMC2B1S4A3_AP3_aluno.docx
@@ -247,35 +247,15 @@
         <w:contextualSpacing w:val="0"/>
         <w:rPr>
           <w:rFonts w:cs="Poppins"/>
-          <w:highlight w:val="yellow"/>
           <w:lang w:val="pt-BR"/>
         </w:rPr>
       </w:pPr>
       <w:r>
         <w:rPr>
           <w:rFonts w:cs="Poppins"/>
-          <w:highlight w:val="yellow"/>
-          <w:lang w:val="pt-BR"/>
-        </w:rPr>
-        <w:t xml:space="preserve">Notebook da atividade </w:t>
-      </w:r>
-      <w:proofErr w:type="gramStart"/>
-      <w:r>
-        <w:rPr>
-          <w:rFonts w:cs="Poppins"/>
-          <w:highlight w:val="yellow"/>
-          <w:lang w:val="pt-BR"/>
-        </w:rPr>
-        <w:t>prática  fornecido</w:t>
-      </w:r>
-      <w:proofErr w:type="gramEnd"/>
-      <w:r>
-        <w:rPr>
-          <w:rFonts w:cs="Poppins"/>
-          <w:highlight w:val="yellow"/>
-          <w:lang w:val="pt-BR"/>
-        </w:rPr>
-        <w:t xml:space="preserve"> pelo professor, por meio do link:</w:t>
+          <w:lang w:val="pt-BR"/>
+        </w:rPr>
+        <w:t>Notebook da atividade prática  fornecido pelo professor, por meio do link:</w:t>
       </w:r>
     </w:p>
     <w:p>
@@ -290,6 +270,48 @@
         <w:contextualSpacing w:val="0"/>
         <w:rPr>
           <w:rFonts w:cs="Poppins"/>
+          <w:lang w:val="pt-BR"/>
+        </w:rPr>
+      </w:pPr>
+      <w:hyperlink r:id="rId8" w:history="1">
+        <w:r>
+          <w:rPr>
+            <w:rStyle w:val="Hyperlink"/>
+            <w:rFonts w:cs="Poppins"/>
+            <w:lang w:val="pt-BR"/>
+          </w:rPr>
+          <w:t>https://github.com/ept-seduc-sp/dados-ano2/blob/main/MATERIAL_2027/C2/S4/DADOS3EMC2B1S4A3_AP3_aluno.ipynb</w:t>
+        </w:r>
+      </w:hyperlink>
+    </w:p>
+    <w:p>
+      <w:pPr>
+        <w:pStyle w:val="Commarcadores"/>
+        <w:numPr>
+          <w:ilvl w:val="0"/>
+          <w:numId w:val="0"/>
+        </w:numPr>
+        <w:spacing w:after="0"/>
+        <w:ind w:left="360"/>
+        <w:contextualSpacing w:val="0"/>
+        <w:rPr>
+          <w:rFonts w:cs="Poppins"/>
+          <w:lang w:val="pt-BR"/>
+        </w:rPr>
+      </w:pPr>
+    </w:p>
+    <w:p>
+      <w:pPr>
+        <w:pStyle w:val="Commarcadores"/>
+        <w:numPr>
+          <w:ilvl w:val="0"/>
+          <w:numId w:val="0"/>
+        </w:numPr>
+        <w:spacing w:after="0"/>
+        <w:ind w:left="360"/>
+        <w:contextualSpacing w:val="0"/>
+        <w:rPr>
+          <w:rFonts w:cs="Poppins"/>
           <w:highlight w:val="yellow"/>
           <w:lang w:val="pt-BR"/>
         </w:rPr>
@@ -331,6 +353,17 @@
         </w:rPr>
         <w:t>Você integra uma equipe de dados que prepara um briefing estatístico para uma reunião de acompanhamento da Olist. Em cada missão, observe a demanda recebida, processe os dados no notebook e registre uma conclusão sustentada por evidências.</w:t>
       </w:r>
+    </w:p>
+    <w:p>
+      <w:pPr>
+        <w:pStyle w:val="Ttulo2"/>
+        <w:spacing w:before="0"/>
+        <w:rPr>
+          <w:rFonts w:ascii="Poppins" w:hAnsi="Poppins" w:cs="Poppins"/>
+          <w:color w:val="000000" w:themeColor="text1"/>
+          <w:lang w:val="pt-BR"/>
+        </w:rPr>
+      </w:pPr>
     </w:p>
     <w:p>
       <w:pPr>
@@ -484,6 +517,7 @@
                 <w:color w:val="000000" w:themeColor="text1"/>
                 <w:lang w:val="pt-BR"/>
               </w:rPr>
+              <w:lastRenderedPageBreak/>
               <w:t>Medida</w:t>
             </w:r>
           </w:p>
@@ -726,7 +760,6 @@
           <w:color w:val="000000" w:themeColor="text1"/>
           <w:lang w:val="pt-BR"/>
         </w:rPr>
-        <w:lastRenderedPageBreak/>
         <w:t>Medida selecionada e justificativa:</w:t>
       </w:r>
     </w:p>
@@ -963,25 +996,7 @@
           <w:color w:val="000000" w:themeColor="text1"/>
           <w:lang w:val="pt-BR"/>
         </w:rPr>
-        <w:t xml:space="preserve">5. Escolha </w:t>
-      </w:r>
-      <w:proofErr w:type="gramStart"/>
-      <w:r>
-        <w:rPr>
-          <w:rFonts w:cs="Poppins"/>
-          <w:color w:val="000000" w:themeColor="text1"/>
-          <w:lang w:val="pt-BR"/>
-        </w:rPr>
-        <w:t>a</w:t>
-      </w:r>
-      <w:proofErr w:type="gramEnd"/>
-      <w:r>
-        <w:rPr>
-          <w:rFonts w:cs="Poppins"/>
-          <w:color w:val="000000" w:themeColor="text1"/>
-          <w:lang w:val="pt-BR"/>
-        </w:rPr>
-        <w:t xml:space="preserve"> medida que melhor representa o frete típico e justifique com os dados.</w:t>
+        <w:t>5. Escolha a medida que melhor representa o frete típico e justifique com os dados.</w:t>
       </w:r>
     </w:p>
     <w:tbl>
@@ -2113,26 +2128,6 @@
         </w:rPr>
         <w:t>_________________________________________________________________</w:t>
       </w:r>
-    </w:p>
-    <w:p>
-      <w:pPr>
-        <w:spacing w:after="0"/>
-        <w:rPr>
-          <w:rFonts w:cs="Poppins"/>
-          <w:color w:val="000000" w:themeColor="text1"/>
-          <w:lang w:val="pt-BR"/>
-        </w:rPr>
-      </w:pPr>
-    </w:p>
-    <w:p>
-      <w:pPr>
-        <w:spacing w:after="0"/>
-        <w:rPr>
-          <w:rFonts w:cs="Poppins"/>
-          <w:color w:val="000000" w:themeColor="text1"/>
-          <w:lang w:val="pt-BR"/>
-        </w:rPr>
-      </w:pPr>
     </w:p>
     <w:p>
       <w:pPr>
@@ -2663,12 +2658,12 @@
       </w:pPr>
     </w:p>
     <w:sectPr>
-      <w:headerReference w:type="even" r:id="rId8"/>
-      <w:headerReference w:type="default" r:id="rId9"/>
-      <w:footerReference w:type="even" r:id="rId10"/>
-      <w:footerReference w:type="default" r:id="rId11"/>
-      <w:headerReference w:type="first" r:id="rId12"/>
-      <w:footerReference w:type="first" r:id="rId13"/>
+      <w:headerReference w:type="even" r:id="rId9"/>
+      <w:headerReference w:type="default" r:id="rId10"/>
+      <w:footerReference w:type="even" r:id="rId11"/>
+      <w:footerReference w:type="default" r:id="rId12"/>
+      <w:headerReference w:type="first" r:id="rId13"/>
+      <w:footerReference w:type="first" r:id="rId14"/>
       <w:pgSz w:w="12240" w:h="15840"/>
       <w:pgMar w:top="648" w:right="864" w:bottom="648" w:left="864" w:header="720" w:footer="720" w:gutter="0"/>
       <w:cols w:space="720"/>
@@ -14639,6 +14634,18 @@
       <w:u w:val="single"/>
     </w:rPr>
   </w:style>
+  <w:style w:type="character" w:styleId="MenoPendente">
+    <w:name w:val="Unresolved Mention"/>
+    <w:basedOn w:val="Fontepargpadro"/>
+    <w:uiPriority w:val="99"/>
+    <w:semiHidden/>
+    <w:unhideWhenUsed/>
+    <w:rsid w:val="009F37E3"/>
+    <w:rPr>
+      <w:color w:val="605E5C"/>
+      <w:shd w:val="clear" w:color="auto" w:fill="E1DFDD"/>
+    </w:rPr>
+  </w:style>
 </w:styles>
 </file>
 

</xml_diff>